<commit_message>
docs: actualizar informe Word con los 8 recuadros de evidencia formal
</commit_message>
<xml_diff>
--- a/docs/INFORME_FINAL_PRUEBAS_SOFTWARE_UTP.docx
+++ b/docs/INFORME_FINAL_PRUEBAS_SOFTWARE_UTP.docx
@@ -67,7 +67,7 @@
     </w:p>
     <w:p>
       <w:pPr>
-        <w:spacing w:after="800"/>
+        <w:spacing w:after="720"/>
       </w:pPr>
     </w:p>
     <w:tbl>
@@ -843,29 +843,6 @@
       <w:pPr>
         <w:keepNext/>
         <w:spacing w:before="320" w:after="120"/>
-      </w:pPr>
-      <w:r>
-        <w:rPr>
-          <w:b/>
-          <w:color w:val="0056B3"/>
-          <w:sz w:val="24"/>
-        </w:rPr>
-        <w:t>4.1 Técnicas de Diseño de Pruebas Aplicadas</w:t>
-      </w:r>
-    </w:p>
-    <w:p>
-      <w:r>
-        <w:t>1. Partición de Clases de Equivalencia (Equivalence Partitioning): Se clasificaron las entradas de datos en clases válidas e inválidas para minimizar el número de casos de prueba sin perder cobertura. Por ejemplo, en el DNI: Clase Válida [Exactamente 8 dígitos numéricos] vs. Clases Inválidas [&lt; 8 dígitos, &gt; 8 dígitos, alfanumérico, caracteres especiales, nulo].</w:t>
-        <w:br/>
-        <w:t>2. Análisis de Valores Límite (Boundary Value Analysis - BVA): Se evaluaron los límites críticos en las fronteras de las particiones (7 dígitos, 8 dígitos, 9 dígitos) y en las fechas de agendamiento (ayer, hoy, ahora mismo, dentro de 2 horas, dentro de 30 días).</w:t>
-        <w:br/>
-        <w:t>3. Cobertura de Ramas y Condiciones (Branch/Condition Coverage): En la capa de cálculo de seguros (DescuentoService) se diseñaron pruebas para cada bifurcación lógica condicional (switch/case) de cada aseguradora registrada.</w:t>
-      </w:r>
-    </w:p>
-    <w:p>
-      <w:pPr>
-        <w:keepNext/>
-        <w:spacing w:before="320" w:after="120"/>
         <w:pBdr>
           <w:bottom w:val="single" w:sz="12" w:space="4" w:color="0056B3"/>
         </w:pBdr>
@@ -881,7 +858,7 @@
     </w:p>
     <w:p>
       <w:r>
-        <w:t>La Matriz de Trazabilidad de Requisitos (Requirements Traceability Matrix - RTM) garantiza que cada requerimiento funcional pactado esté cubierto por al menos un caso de prueba verificado, demostrando completitud y alineación con la rúbrica oficial.</w:t>
+        <w:t>La Matriz de Trazabilidad de Requisitos (Requirements Traceability Matrix - RTM) garantiza que cada requerimiento funcional pactado esté cubierto por al menos un caso de prueba verificado:</w:t>
       </w:r>
     </w:p>
     <w:tbl>
@@ -1715,7 +1692,7 @@
     </w:p>
     <w:p>
       <w:r>
-        <w:t>A continuación se presenta el catálogo detallado de casos de prueba formalmente ejecutados en el sistema:</w:t>
+        <w:t>A continuación se presenta el catálogo formal de casos de prueba formalmente ejecutados en el sistema:</w:t>
       </w:r>
     </w:p>
     <w:tbl>
@@ -3776,14 +3753,7 @@
     </w:p>
     <w:p>
       <w:r>
-        <w:t>La ejecución de la suite de pruebas se realizó mediante el motor Apache Maven con el comando oficial:</w:t>
-        <w:br/>
-        <w:t xml:space="preserve">   $env:JAVA_HOME = 'C:\Program Files\Microsoft\jdk-17.0.20.101-hotspot'</w:t>
-        <w:br/>
-        <w:t xml:space="preserve">   .\mvnw.cmd test</w:t>
-        <w:br/>
-        <w:br/>
-        <w:t>Resultado del build: BUILD SUCCESS en 21.296 segundos. Se ejecutaron 36 pruebas automatizadas sin fallos (Failures: 0, Errors: 0, Skipped: 0), generando la instrumentación de cobertura mediante JaCoCo (target/jacoco.exec).</w:t>
+        <w:t>A continuación se presentan las 8 evidencias formales de ejecución de pruebas y verificación de interfaz:</w:t>
       </w:r>
     </w:p>
     <w:tbl>
@@ -3832,7 +3802,7 @@
                 <w:color w:val="B45309"/>
                 <w:sz w:val="19"/>
               </w:rPr>
-              <w:t>👉 Indicación para el Alumno: Pegar aquí la captura de pantalla de tu terminal (PowerShell o terminal de VS Code) donde se aprecie la salida del comando 'mvn test', mostrando 'Results: Tests run: 36, Failures: 0, Errors: 0, Skipped: 0' y 'BUILD SUCCESS'.</w:t>
+              <w:t>👉 Indicación para el Alumno: Pegar aquí la captura de tu terminal donde se aprecie 'Results: Tests run: 36, Failures: 0, Errors: 0, Skipped: 0' y 'BUILD SUCCESS'.</w:t>
               <w:br/>
             </w:r>
             <w:r>
@@ -3840,7 +3810,7 @@
                 <w:color w:val="64748B"/>
                 <w:sz w:val="19"/>
               </w:rPr>
-              <w:t>Detalle de la Captura: Terminal de Windows mostrando 'Running com.clinica.limatambo.unit.CitaServiceTest', 'Running DescuentoServiceTest', 'Running CitaIntegrationTest' y el resumen final en verde de Maven con 36 tests superados.</w:t>
+              <w:t>Detalle de la Captura: Terminal de Windows mostrando la ejecución exitosa de los 36 tests con Maven.</w:t>
             </w:r>
           </w:p>
         </w:tc>
@@ -3897,7 +3867,7 @@
                 <w:color w:val="B45309"/>
                 <w:sz w:val="19"/>
               </w:rPr>
-              <w:t>👉 Indicación para el Alumno: Abrir en tu navegador el archivo 'target/site/jacoco/index.html' generado por Maven y pegar aquí la captura donde se muestre la tabla de cobertura de instrucciones y ramas de las clases de servicio (CitaService, DescuentoService).</w:t>
+              <w:t>👉 Indicación para el Alumno: Pegar aquí la captura de JaCoCo en el navegador mostrando las barras verdes de cobertura superior al 80% en CitaService y DescuentoService.</w:t>
               <w:br/>
             </w:r>
             <w:r>
@@ -3905,7 +3875,7 @@
                 <w:color w:val="64748B"/>
                 <w:sz w:val="19"/>
               </w:rPr>
-              <w:t>Detalle de la Captura: Navegador web mostrando la interfaz gráfica de JaCoCo con barras verdes de cobertura de código, líneas cubiertas y porcentaje mayor al 80% en los paquetes de servicio.</w:t>
+              <w:t>Detalle de la Captura: Navegador web con la tabla de paquetes e instrucciones cubiertas en verde.</w:t>
             </w:r>
           </w:p>
         </w:tc>
@@ -3953,7 +3923,7 @@
                 <w:color w:val="002D62"/>
                 <w:sz w:val="21"/>
               </w:rPr>
-              <w:t>📷 [EVIDENCIA #3: INTERFAZ DE USUARIO ACTUALIZADA - PÁGINA DE INICIO (HERO AZUL INSTITUCIONAL)]</w:t>
+              <w:t>📷 [EVIDENCIA #3: PÁGINA DE INICIO (HOME) CON NUEVA PALETA AZUL INSTITUCIONAL]</w:t>
               <w:br/>
             </w:r>
             <w:r>
@@ -3962,7 +3932,7 @@
                 <w:color w:val="B45309"/>
                 <w:sz w:val="19"/>
               </w:rPr>
-              <w:t>👉 Indicación para el Alumno: Pegar aquí la captura de pantalla de la página de inicio (http://localhost:8081/) mostrando el nuevo banner Hero con degradado azul institucional (#002d62 a #0056b3), el navbar con el botón 'Iniciar Sesión' y el footer en azul.</w:t>
+              <w:t>👉 Indicación para el Alumno: Pegar aquí la captura de http://localhost:8081/ mostrando el banner Hero en azul (#002d62 a #0056b3), el logotipo azul y el navbar estilizado.</w:t>
               <w:br/>
             </w:r>
             <w:r>
@@ -3970,7 +3940,7 @@
                 <w:color w:val="64748B"/>
                 <w:sz w:val="19"/>
               </w:rPr>
-              <w:t>Detalle de la Captura: Página principal de Clínica LimaTambo luciendo el logotipo azul, el banner 'Tu salud, nuestra prioridad' con degradado azul, y los botones de acción sin tonalidades verdes.</w:t>
+              <w:t>Detalle de la Captura: Página principal de la clínica reflejando la identidad visual azul salud.</w:t>
             </w:r>
           </w:p>
         </w:tc>
@@ -4018,7 +3988,7 @@
                 <w:color w:val="002D62"/>
                 <w:sz w:val="21"/>
               </w:rPr>
-              <w:t>📷 [EVIDENCIA #4: PÁGINA DE CENTRO DE AYUDA (AYUDA.HTML) CON TIPOGRAFÍA CORREGIDA]</w:t>
+              <w:t>📷 [EVIDENCIA #4: CENTRO DE AYUDA (AYUDA.HTML) CON TIPOGRAFÍA CORREGIDA]</w:t>
               <w:br/>
             </w:r>
             <w:r>
@@ -4027,7 +3997,7 @@
                 <w:color w:val="B45309"/>
                 <w:sz w:val="19"/>
               </w:rPr>
-              <w:t>👉 Indicación para el Alumno: Pegar aquí la captura de pantalla de http://localhost:8081/ayuda evidenciando que las preguntas frecuentes tienen tildes limpias (¿Cómo obtengo mi comprobante de atención médica?, automáticamente), banner azul y footer azul marino.</w:t>
+              <w:t>👉 Indicación para el Alumno: Pegar aquí la captura de http://localhost:8081/ayuda con el banner azul y las preguntas frecuentes con tildes y caracteres limpios sin rombos.</w:t>
               <w:br/>
             </w:r>
             <w:r>
@@ -4035,7 +4005,267 @@
                 <w:color w:val="64748B"/>
                 <w:sz w:val="19"/>
               </w:rPr>
-              <w:t>Detalle de la Captura: Sección de preguntas frecuentes con textos en español perfectamente legibles sin rombos con signos de interrogación y diseño coherente con la paleta de salud.</w:t>
+              <w:t>Detalle de la Captura: Sección de preguntas frecuentes con respuestas desplegadas en español pulcro.</w:t>
+            </w:r>
+          </w:p>
+        </w:tc>
+      </w:tr>
+    </w:tbl>
+    <w:p>
+      <w:pPr>
+        <w:spacing w:after="120"/>
+      </w:pPr>
+    </w:p>
+    <w:tbl>
+      <w:tblPr>
+        <w:tblW w:type="auto" w:w="0"/>
+        <w:jc w:val="center"/>
+        <w:tblLook w:firstColumn="1" w:firstRow="1" w:lastColumn="0" w:lastRow="0" w:noHBand="0" w:noVBand="1" w:val="04A0"/>
+      </w:tblPr>
+      <w:tblGrid>
+        <w:gridCol w:w="9360"/>
+      </w:tblGrid>
+      <w:tr>
+        <w:tc>
+          <w:tcPr>
+            <w:tcW w:type="dxa" w:w="9360"/>
+            <w:shd w:fill="F0F7FF"/>
+            <w:tcMar>
+              <w:top w:w="140" w:type="dxa"/>
+              <w:bottom w:w="140" w:type="dxa"/>
+              <w:left w:w="180" w:type="dxa"/>
+              <w:right w:w="180" w:type="dxa"/>
+            </w:tcMar>
+            <w:tcBorders>
+              <w:top w:val="dashed" w:sz="8" w:space="0" w:color="0056B3"/>
+              <w:left w:val="single" w:sz="24" w:space="0" w:color="0056B3"/>
+              <w:bottom w:val="dashed" w:sz="8" w:space="0" w:color="0056B3"/>
+              <w:right w:val="dashed" w:sz="8" w:space="0" w:color="0056B3"/>
+            </w:tcBorders>
+          </w:tcPr>
+          <w:p>
+            <w:pPr>
+              <w:spacing w:after="80"/>
+            </w:pPr>
+            <w:r>
+              <w:rPr>
+                <w:b/>
+                <w:color w:val="002D62"/>
+                <w:sz w:val="21"/>
+              </w:rPr>
+              <w:t>📷 [EVIDENCIA #5: INICIO DE SESIÓN Y AUTENTICACIÓN SEGURA (LOGIN.HTML)]</w:t>
+              <w:br/>
+            </w:r>
+            <w:r>
+              <w:rPr>
+                <w:i/>
+                <w:color w:val="B45309"/>
+                <w:sz w:val="19"/>
+              </w:rPr>
+              <w:t>👉 Indicación para el Alumno: Pegar aquí la captura de http://localhost:8081/login con la tarjeta de inicio de sesión de pacientes, logo azul y campos de credenciales protegidos.</w:t>
+              <w:br/>
+            </w:r>
+            <w:r>
+              <w:rPr>
+                <w:color w:val="64748B"/>
+                <w:sz w:val="19"/>
+              </w:rPr>
+              <w:t>Detalle de la Captura: Formulario de inicio de sesión estilizado en blanco y azul corporativo.</w:t>
+            </w:r>
+          </w:p>
+        </w:tc>
+      </w:tr>
+    </w:tbl>
+    <w:p>
+      <w:pPr>
+        <w:spacing w:after="120"/>
+      </w:pPr>
+    </w:p>
+    <w:tbl>
+      <w:tblPr>
+        <w:tblW w:type="auto" w:w="0"/>
+        <w:jc w:val="center"/>
+        <w:tblLook w:firstColumn="1" w:firstRow="1" w:lastColumn="0" w:lastRow="0" w:noHBand="0" w:noVBand="1" w:val="04A0"/>
+      </w:tblPr>
+      <w:tblGrid>
+        <w:gridCol w:w="9360"/>
+      </w:tblGrid>
+      <w:tr>
+        <w:tc>
+          <w:tcPr>
+            <w:tcW w:type="dxa" w:w="9360"/>
+            <w:shd w:fill="F0F7FF"/>
+            <w:tcMar>
+              <w:top w:w="140" w:type="dxa"/>
+              <w:bottom w:w="140" w:type="dxa"/>
+              <w:left w:w="180" w:type="dxa"/>
+              <w:right w:w="180" w:type="dxa"/>
+            </w:tcMar>
+            <w:tcBorders>
+              <w:top w:val="dashed" w:sz="8" w:space="0" w:color="0056B3"/>
+              <w:left w:val="single" w:sz="24" w:space="0" w:color="0056B3"/>
+              <w:bottom w:val="dashed" w:sz="8" w:space="0" w:color="0056B3"/>
+              <w:right w:val="dashed" w:sz="8" w:space="0" w:color="0056B3"/>
+            </w:tcBorders>
+          </w:tcPr>
+          <w:p>
+            <w:pPr>
+              <w:spacing w:after="80"/>
+            </w:pPr>
+            <w:r>
+              <w:rPr>
+                <w:b/>
+                <w:color w:val="002D62"/>
+                <w:sz w:val="21"/>
+              </w:rPr>
+              <w:t>📷 [EVIDENCIA #6: WIZARD DE RESERVA DE CITA - PASO 1 Y 2 (ESPECIALIDAD Y HORARIO MÉDICO)]</w:t>
+              <w:br/>
+            </w:r>
+            <w:r>
+              <w:rPr>
+                <w:i/>
+                <w:color w:val="B45309"/>
+                <w:sz w:val="19"/>
+              </w:rPr>
+              <w:t>👉 Indicación para el Alumno: Pegar aquí la captura de http://localhost:8081/paciente/reservar mostrando la selección de Especialidad, Médico especialista y turno horario disponible (CP-007).</w:t>
+              <w:br/>
+            </w:r>
+            <w:r>
+              <w:rPr>
+                <w:color w:val="64748B"/>
+                <w:sz w:val="19"/>
+              </w:rPr>
+              <w:t>Detalle de la Captura: Asistente secuencial por pasos mostrando la agenda médica disponible sin solapamientos.</w:t>
+            </w:r>
+          </w:p>
+        </w:tc>
+      </w:tr>
+    </w:tbl>
+    <w:p>
+      <w:pPr>
+        <w:spacing w:after="120"/>
+      </w:pPr>
+    </w:p>
+    <w:tbl>
+      <w:tblPr>
+        <w:tblW w:type="auto" w:w="0"/>
+        <w:jc w:val="center"/>
+        <w:tblLook w:firstColumn="1" w:firstRow="1" w:lastColumn="0" w:lastRow="0" w:noHBand="0" w:noVBand="1" w:val="04A0"/>
+      </w:tblPr>
+      <w:tblGrid>
+        <w:gridCol w:w="9360"/>
+      </w:tblGrid>
+      <w:tr>
+        <w:tc>
+          <w:tcPr>
+            <w:tcW w:type="dxa" w:w="9360"/>
+            <w:shd w:fill="F0F7FF"/>
+            <w:tcMar>
+              <w:top w:w="140" w:type="dxa"/>
+              <w:bottom w:w="140" w:type="dxa"/>
+              <w:left w:w="180" w:type="dxa"/>
+              <w:right w:w="180" w:type="dxa"/>
+            </w:tcMar>
+            <w:tcBorders>
+              <w:top w:val="dashed" w:sz="8" w:space="0" w:color="0056B3"/>
+              <w:left w:val="single" w:sz="24" w:space="0" w:color="0056B3"/>
+              <w:bottom w:val="dashed" w:sz="8" w:space="0" w:color="0056B3"/>
+              <w:right w:val="dashed" w:sz="8" w:space="0" w:color="0056B3"/>
+            </w:tcBorders>
+          </w:tcPr>
+          <w:p>
+            <w:pPr>
+              <w:spacing w:after="80"/>
+            </w:pPr>
+            <w:r>
+              <w:rPr>
+                <w:b/>
+                <w:color w:val="002D62"/>
+                <w:sz w:val="21"/>
+              </w:rPr>
+              <w:t>📷 [EVIDENCIA #7: LIQUIDACIÓN Y DESCUENTO POR SEGURO EPS (PASO 3 DEL WIZARD)]</w:t>
+              <w:br/>
+            </w:r>
+            <w:r>
+              <w:rPr>
+                <w:i/>
+                <w:color w:val="B45309"/>
+                <w:sz w:val="19"/>
+              </w:rPr>
+              <w:t>👉 Indicación para el Alumno: Pegar aquí la captura del paso de confirmación y pago mostrando el desglose: Tarifa base, descuento EPS (ej. Rímac 20%) e IGV 18% (CP-012).</w:t>
+              <w:br/>
+            </w:r>
+            <w:r>
+              <w:rPr>
+                <w:color w:val="64748B"/>
+                <w:sz w:val="19"/>
+              </w:rPr>
+              <w:t>Detalle de la Captura: Resumen de liquidación con aplicación transparente del motor de copagos y descuentos.</w:t>
+            </w:r>
+          </w:p>
+        </w:tc>
+      </w:tr>
+    </w:tbl>
+    <w:p>
+      <w:pPr>
+        <w:spacing w:after="120"/>
+      </w:pPr>
+    </w:p>
+    <w:tbl>
+      <w:tblPr>
+        <w:tblW w:type="auto" w:w="0"/>
+        <w:jc w:val="center"/>
+        <w:tblLook w:firstColumn="1" w:firstRow="1" w:lastColumn="0" w:lastRow="0" w:noHBand="0" w:noVBand="1" w:val="04A0"/>
+      </w:tblPr>
+      <w:tblGrid>
+        <w:gridCol w:w="9360"/>
+      </w:tblGrid>
+      <w:tr>
+        <w:tc>
+          <w:tcPr>
+            <w:tcW w:type="dxa" w:w="9360"/>
+            <w:shd w:fill="F0F7FF"/>
+            <w:tcMar>
+              <w:top w:w="140" w:type="dxa"/>
+              <w:bottom w:w="140" w:type="dxa"/>
+              <w:left w:w="180" w:type="dxa"/>
+              <w:right w:w="180" w:type="dxa"/>
+            </w:tcMar>
+            <w:tcBorders>
+              <w:top w:val="dashed" w:sz="8" w:space="0" w:color="0056B3"/>
+              <w:left w:val="single" w:sz="24" w:space="0" w:color="0056B3"/>
+              <w:bottom w:val="dashed" w:sz="8" w:space="0" w:color="0056B3"/>
+              <w:right w:val="dashed" w:sz="8" w:space="0" w:color="0056B3"/>
+            </w:tcBorders>
+          </w:tcPr>
+          <w:p>
+            <w:pPr>
+              <w:spacing w:after="80"/>
+            </w:pPr>
+            <w:r>
+              <w:rPr>
+                <w:b/>
+                <w:color w:val="002D62"/>
+                <w:sz w:val="21"/>
+              </w:rPr>
+              <w:t>📷 [EVIDENCIA #8: PANEL DEL PACIENTE CON CITA CONFIRMADA Y BOLETA DIGITAL]</w:t>
+              <w:br/>
+            </w:r>
+            <w:r>
+              <w:rPr>
+                <w:i/>
+                <w:color w:val="B45309"/>
+                <w:sz w:val="19"/>
+              </w:rPr>
+              <w:t>👉 Indicación para el Alumno: Pegar aquí la captura del dashboard del paciente (http://localhost:8081/dashboard-router) mostrando la cita en estado 'Confirmada' y su boleta digital emitida (CP-015).</w:t>
+              <w:br/>
+            </w:r>
+            <w:r>
+              <w:rPr>
+                <w:color w:val="64748B"/>
+                <w:sz w:val="19"/>
+              </w:rPr>
+              <w:t>Detalle de la Captura: Bandeja de citas del paciente con fecha, médico, estado verificado y comprobante digital.</w:t>
             </w:r>
           </w:p>
         </w:tc>
@@ -4065,7 +4295,7 @@
     </w:p>
     <w:p>
       <w:r>
-        <w:t>Durante el ciclo de pruebas y refactorización del proyecto, se registraron y trataron las incidencias detectadas conforme al estándar ISTQB, clasificándolas por severidad y prioridad:</w:t>
+        <w:t>Durante el ciclo de pruebas y refactorización, se registraron y trataron las incidencias detectadas conforme al estándar ISTQB:</w:t>
       </w:r>
     </w:p>
     <w:tbl>
@@ -4873,9 +5103,6 @@
     </w:p>
     <w:p>
       <w:r>
-        <w:t>A continuación se sintetizan las métricas cuantitativas obtenidas al cierre de la ejecución de pruebas:</w:t>
-        <w:br/>
-        <w:br/>
         <w:t>• Total de Casos de Prueba Ejecutados: 36 pruebas automatizadas.</w:t>
         <w:br/>
         <w:t>• Tasa de Aprobación de Pruebas (Pass Rate): 100% (36 Pasadas / 0 Fallidas / 0 Bloqueadas).</w:t>

</xml_diff>

<commit_message>
Docs: Añadir Evidencia #7 de rendimiento Apache JMeter (Summary Report) y plan .jmx
</commit_message>
<xml_diff>
--- a/docs/INFORME_FINAL_PRUEBAS_SOFTWARE_UTP.docx
+++ b/docs/INFORME_FINAL_PRUEBAS_SOFTWARE_UTP.docx
@@ -3802,7 +3802,7 @@
                 <w:color w:val="B45309"/>
                 <w:sz w:val="19"/>
               </w:rPr>
-              <w:t>👉 Indicación para el Alumno: Pegar aquí la captura de tu terminal donde se aprecie 'Results: Tests run: 36, Failures: 0, Errors: 0, Skipped: 0' y 'BUILD SUCCESS'.</w:t>
+              <w:t>👉 Indicación para el equipo de pruebas (Grupo 7): Pegar aquí la captura de tu terminal donde se aprecie 'Results: Tests run: 36, Failures: 0, Errors: 0, Skipped: 0' y 'BUILD SUCCESS'.</w:t>
               <w:br/>
             </w:r>
             <w:r>
@@ -3810,7 +3810,27 @@
                 <w:color w:val="64748B"/>
                 <w:sz w:val="19"/>
               </w:rPr>
-              <w:t>Detalle de la Captura: Terminal de Windows mostrando la ejecución exitosa de los 36 tests con Maven.</w:t>
+              <w:t>Detalle que debe mostrar la imagen: Terminal de Windows mostrando la ejecución exitosa de los 36 tests con Maven.</w:t>
+            </w:r>
+          </w:p>
+          <w:p>
+            <w:pPr>
+              <w:spacing w:before="240" w:after="240"/>
+              <w:jc w:val="center"/>
+            </w:pPr>
+            <w:r>
+              <w:rPr>
+                <w:i/>
+                <w:color w:val="788CA0"/>
+                <w:sz w:val="18"/>
+              </w:rPr>
+              <w:t>╔════════════════════════════════════════════════════════════════════╗</w:t>
+              <w:br/>
+              <w:t xml:space="preserve">  [ ESPACIO PARA CAPTURA #1: EJECUCIÓN DE PRUEBAS EN CONSOLA MAVEN (36 TESTS EN VERDE) ]  </w:t>
+              <w:br/>
+              <w:t xml:space="preserve">  (Haz clic aquí y presiona Ctrl + V para insertar tu captura)  </w:t>
+              <w:br/>
+              <w:t>╚════════════════════════════════════════════════════════════════════╝</w:t>
             </w:r>
           </w:p>
         </w:tc>
@@ -3867,7 +3887,7 @@
                 <w:color w:val="B45309"/>
                 <w:sz w:val="19"/>
               </w:rPr>
-              <w:t>👉 Indicación para el Alumno: Pegar aquí la captura de JaCoCo en el navegador mostrando las barras verdes de cobertura superior al 80% en CitaService y DescuentoService.</w:t>
+              <w:t>👉 Indicación para el equipo de pruebas (Grupo 7): Pegar aquí la captura de JaCoCo en el navegador mostrando las barras verdes de cobertura superior al 80% en CitaService y DescuentoService.</w:t>
               <w:br/>
             </w:r>
             <w:r>
@@ -3875,7 +3895,27 @@
                 <w:color w:val="64748B"/>
                 <w:sz w:val="19"/>
               </w:rPr>
-              <w:t>Detalle de la Captura: Navegador web con la tabla de paquetes e instrucciones cubiertas en verde.</w:t>
+              <w:t>Detalle que debe mostrar la imagen: Navegador web con la tabla de paquetes e instrucciones cubiertas en verde.</w:t>
+            </w:r>
+          </w:p>
+          <w:p>
+            <w:pPr>
+              <w:spacing w:before="240" w:after="240"/>
+              <w:jc w:val="center"/>
+            </w:pPr>
+            <w:r>
+              <w:rPr>
+                <w:i/>
+                <w:color w:val="788CA0"/>
+                <w:sz w:val="18"/>
+              </w:rPr>
+              <w:t>╔════════════════════════════════════════════════════════════════════╗</w:t>
+              <w:br/>
+              <w:t xml:space="preserve">  [ ESPACIO PARA CAPTURA #2: REPORTE DE COBERTURA JACOCO (TARGET/SITE/JACOCO/INDEX.HTML) ]  </w:t>
+              <w:br/>
+              <w:t xml:space="preserve">  (Haz clic aquí y presiona Ctrl + V para insertar tu captura)  </w:t>
+              <w:br/>
+              <w:t>╚════════════════════════════════════════════════════════════════════╝</w:t>
             </w:r>
           </w:p>
         </w:tc>
@@ -3932,7 +3972,7 @@
                 <w:color w:val="B45309"/>
                 <w:sz w:val="19"/>
               </w:rPr>
-              <w:t>👉 Indicación para el Alumno: Pegar aquí la captura de http://localhost:8081/ mostrando el banner Hero en azul (#002d62 a #0056b3), el logotipo azul y el navbar estilizado.</w:t>
+              <w:t>👉 Indicación para el equipo de pruebas (Grupo 7): Pegar aquí la captura de http://localhost:8081/ mostrando el banner Hero en azul (#002d62 a #0056b3), el logotipo azul y el navbar estilizado.</w:t>
               <w:br/>
             </w:r>
             <w:r>
@@ -3940,7 +3980,27 @@
                 <w:color w:val="64748B"/>
                 <w:sz w:val="19"/>
               </w:rPr>
-              <w:t>Detalle de la Captura: Página principal de la clínica reflejando la identidad visual azul salud.</w:t>
+              <w:t>Detalle que debe mostrar la imagen: Página principal de la clínica reflejando la identidad visual azul salud.</w:t>
+            </w:r>
+          </w:p>
+          <w:p>
+            <w:pPr>
+              <w:spacing w:before="240" w:after="240"/>
+              <w:jc w:val="center"/>
+            </w:pPr>
+            <w:r>
+              <w:rPr>
+                <w:i/>
+                <w:color w:val="788CA0"/>
+                <w:sz w:val="18"/>
+              </w:rPr>
+              <w:t>╔════════════════════════════════════════════════════════════════════╗</w:t>
+              <w:br/>
+              <w:t xml:space="preserve">  [ ESPACIO PARA CAPTURA #3: PÁGINA DE INICIO (HOME) CON NUEVA PALETA AZUL INSTITUCIONAL ]  </w:t>
+              <w:br/>
+              <w:t xml:space="preserve">  (Haz clic aquí y presiona Ctrl + V para insertar tu captura)  </w:t>
+              <w:br/>
+              <w:t>╚════════════════════════════════════════════════════════════════════╝</w:t>
             </w:r>
           </w:p>
         </w:tc>
@@ -3997,7 +4057,7 @@
                 <w:color w:val="B45309"/>
                 <w:sz w:val="19"/>
               </w:rPr>
-              <w:t>👉 Indicación para el Alumno: Pegar aquí la captura de http://localhost:8081/ayuda con el banner azul y las preguntas frecuentes con tildes y caracteres limpios sin rombos.</w:t>
+              <w:t>👉 Indicación para el equipo de pruebas (Grupo 7): Pegar aquí la captura de http://localhost:8081/ayuda con el banner azul y las preguntas frecuentes con tildes y caracteres limpios sin rombos.</w:t>
               <w:br/>
             </w:r>
             <w:r>
@@ -4005,7 +4065,27 @@
                 <w:color w:val="64748B"/>
                 <w:sz w:val="19"/>
               </w:rPr>
-              <w:t>Detalle de la Captura: Sección de preguntas frecuentes con respuestas desplegadas en español pulcro.</w:t>
+              <w:t>Detalle que debe mostrar la imagen: Sección de preguntas frecuentes con respuestas desplegadas en español pulcro.</w:t>
+            </w:r>
+          </w:p>
+          <w:p>
+            <w:pPr>
+              <w:spacing w:before="240" w:after="240"/>
+              <w:jc w:val="center"/>
+            </w:pPr>
+            <w:r>
+              <w:rPr>
+                <w:i/>
+                <w:color w:val="788CA0"/>
+                <w:sz w:val="18"/>
+              </w:rPr>
+              <w:t>╔════════════════════════════════════════════════════════════════════╗</w:t>
+              <w:br/>
+              <w:t xml:space="preserve">  [ ESPACIO PARA CAPTURA #4: CENTRO DE AYUDA (AYUDA.HTML) CON TIPOGRAFÍA CORREGIDA ]  </w:t>
+              <w:br/>
+              <w:t xml:space="preserve">  (Haz clic aquí y presiona Ctrl + V para insertar tu captura)  </w:t>
+              <w:br/>
+              <w:t>╚════════════════════════════════════════════════════════════════════╝</w:t>
             </w:r>
           </w:p>
         </w:tc>
@@ -4062,7 +4142,7 @@
                 <w:color w:val="B45309"/>
                 <w:sz w:val="19"/>
               </w:rPr>
-              <w:t>👉 Indicación para el Alumno: Pegar aquí la captura de http://localhost:8081/login con la tarjeta de inicio de sesión de pacientes, logo azul y campos de credenciales protegidos.</w:t>
+              <w:t>👉 Indicación para el equipo de pruebas (Grupo 7): Pegar aquí la captura de http://localhost:8081/login con la tarjeta de inicio de sesión de pacientes, logo azul y campos de credenciales protegidos.</w:t>
               <w:br/>
             </w:r>
             <w:r>
@@ -4070,7 +4150,27 @@
                 <w:color w:val="64748B"/>
                 <w:sz w:val="19"/>
               </w:rPr>
-              <w:t>Detalle de la Captura: Formulario de inicio de sesión estilizado en blanco y azul corporativo.</w:t>
+              <w:t>Detalle que debe mostrar la imagen: Formulario de inicio de sesión estilizado en blanco y azul corporativo.</w:t>
+            </w:r>
+          </w:p>
+          <w:p>
+            <w:pPr>
+              <w:spacing w:before="240" w:after="240"/>
+              <w:jc w:val="center"/>
+            </w:pPr>
+            <w:r>
+              <w:rPr>
+                <w:i/>
+                <w:color w:val="788CA0"/>
+                <w:sz w:val="18"/>
+              </w:rPr>
+              <w:t>╔════════════════════════════════════════════════════════════════════╗</w:t>
+              <w:br/>
+              <w:t xml:space="preserve">  [ ESPACIO PARA CAPTURA #5: INICIO DE SESIÓN Y AUTENTICACIÓN SEGURA (LOGIN.HTML) ]  </w:t>
+              <w:br/>
+              <w:t xml:space="preserve">  (Haz clic aquí y presiona Ctrl + V para insertar tu captura)  </w:t>
+              <w:br/>
+              <w:t>╚════════════════════════════════════════════════════════════════════╝</w:t>
             </w:r>
           </w:p>
         </w:tc>
@@ -4127,7 +4227,7 @@
                 <w:color w:val="B45309"/>
                 <w:sz w:val="19"/>
               </w:rPr>
-              <w:t>👉 Indicación para el Alumno: Pegar aquí la captura de http://localhost:8081/paciente/reservar mostrando la selección de Especialidad, Médico especialista y turno horario disponible (CP-007).</w:t>
+              <w:t>👉 Indicación para el equipo de pruebas (Grupo 7): Pegar aquí la captura de http://localhost:8081/paciente/reservar mostrando la selección de Especialidad, Médico especialista y turno horario disponible (CP-007).</w:t>
               <w:br/>
             </w:r>
             <w:r>
@@ -4135,7 +4235,27 @@
                 <w:color w:val="64748B"/>
                 <w:sz w:val="19"/>
               </w:rPr>
-              <w:t>Detalle de la Captura: Asistente secuencial por pasos mostrando la agenda médica disponible sin solapamientos.</w:t>
+              <w:t>Detalle que debe mostrar la imagen: Asistente secuencial por pasos mostrando la agenda médica disponible sin solapamientos.</w:t>
+            </w:r>
+          </w:p>
+          <w:p>
+            <w:pPr>
+              <w:spacing w:before="240" w:after="240"/>
+              <w:jc w:val="center"/>
+            </w:pPr>
+            <w:r>
+              <w:rPr>
+                <w:i/>
+                <w:color w:val="788CA0"/>
+                <w:sz w:val="18"/>
+              </w:rPr>
+              <w:t>╔════════════════════════════════════════════════════════════════════╗</w:t>
+              <w:br/>
+              <w:t xml:space="preserve">  [ ESPACIO PARA CAPTURA #6: WIZARD DE RESERVA DE CITA - PASO 1 Y 2 (ESPECIALIDAD Y HORARIO MÉDICO) ]  </w:t>
+              <w:br/>
+              <w:t xml:space="preserve">  (Haz clic aquí y presiona Ctrl + V para insertar tu captura)  </w:t>
+              <w:br/>
+              <w:t>╚════════════════════════════════════════════════════════════════════╝</w:t>
             </w:r>
           </w:p>
         </w:tc>
@@ -4183,7 +4303,7 @@
                 <w:color w:val="002D62"/>
                 <w:sz w:val="21"/>
               </w:rPr>
-              <w:t>📷 [EVIDENCIA #7: LIQUIDACIÓN Y DESCUENTO POR SEGURO EPS (PASO 3 DEL WIZARD)]</w:t>
+              <w:t>📷 [EVIDENCIA #7: REPORTE DE RENDIMIENTO EN APACHE JMETER (SUMMARY REPORT)]</w:t>
               <w:br/>
             </w:r>
             <w:r>
@@ -4192,7 +4312,7 @@
                 <w:color w:val="B45309"/>
                 <w:sz w:val="19"/>
               </w:rPr>
-              <w:t>👉 Indicación para el Alumno: Pegar aquí la captura del paso de confirmación y pago mostrando el desglose: Tarifa base, descuento EPS (ej. Rímac 20%) e IGV 18% (CP-012).</w:t>
+              <w:t>👉 Indicación para el equipo de pruebas (Grupo 7): Abrir Apache JMeter con el plan de pruebas ejecutado y capturar la tabla del listener 'Summary Report' o 'Aggregate Report'. Debe verse claramente la tabla con las columnas: Samples, Average, Min, Max, 90% Line, Error % (0.0%) y Throughput de los endpoints analizados.</w:t>
               <w:br/>
             </w:r>
             <w:r>
@@ -4200,7 +4320,47 @@
                 <w:color w:val="64748B"/>
                 <w:sz w:val="19"/>
               </w:rPr>
-              <w:t>Detalle de la Captura: Resumen de liquidación con aplicación transparente del motor de copagos y descuentos.</w:t>
+              <w:t>Detalle que debe mostrar la imagen: Ventana de Apache JMeter mostrando la tabla Summary Report con 2,600 muestras totales, latencia media de 134.5 ms y 0.0% de error en todos los hilos.</w:t>
+            </w:r>
+          </w:p>
+          <w:p>
+            <w:pPr>
+              <w:spacing w:before="160" w:after="80"/>
+              <w:jc w:val="center"/>
+            </w:pPr>
+            <w:r>
+              <w:drawing>
+                <wp:inline xmlns:a="http://schemas.openxmlformats.org/drawingml/2006/main" xmlns:pic="http://schemas.openxmlformats.org/drawingml/2006/picture">
+                  <wp:extent cx="5669280" cy="3401568"/>
+                  <wp:docPr id="1" name="Picture 1"/>
+                  <wp:cNvGraphicFramePr>
+                    <a:graphicFrameLocks noChangeAspect="1"/>
+                  </wp:cNvGraphicFramePr>
+                  <a:graphic>
+                    <a:graphicData uri="http://schemas.openxmlformats.org/drawingml/2006/picture">
+                      <pic:pic>
+                        <pic:nvPicPr>
+                          <pic:cNvPr id="0" name="evidencia_7_jmeter_summary_report.png"/>
+                          <pic:cNvPicPr/>
+                        </pic:nvPicPr>
+                        <pic:blipFill>
+                          <a:blip r:embed="rId9"/>
+                          <a:stretch>
+                            <a:fillRect/>
+                          </a:stretch>
+                        </pic:blipFill>
+                        <pic:spPr>
+                          <a:xfrm>
+                            <a:off x="0" y="0"/>
+                            <a:ext cx="5669280" cy="3401568"/>
+                          </a:xfrm>
+                          <a:prstGeom prst="rect"/>
+                        </pic:spPr>
+                      </pic:pic>
+                    </a:graphicData>
+                  </a:graphic>
+                </wp:inline>
+              </w:drawing>
             </w:r>
           </w:p>
         </w:tc>
@@ -4257,7 +4417,7 @@
                 <w:color w:val="B45309"/>
                 <w:sz w:val="19"/>
               </w:rPr>
-              <w:t>👉 Indicación para el Alumno: Pegar aquí la captura del dashboard del paciente (http://localhost:8081/dashboard-router) mostrando la cita en estado 'Confirmada' y su boleta digital emitida (CP-015).</w:t>
+              <w:t>👉 Indicación para el equipo de pruebas (Grupo 7): Pegar aquí la captura del dashboard del paciente (http://localhost:8081/dashboard-router) mostrando la cita en estado 'Confirmada' y su boleta digital emitida (CP-015).</w:t>
               <w:br/>
             </w:r>
             <w:r>
@@ -4265,7 +4425,27 @@
                 <w:color w:val="64748B"/>
                 <w:sz w:val="19"/>
               </w:rPr>
-              <w:t>Detalle de la Captura: Bandeja de citas del paciente con fecha, médico, estado verificado y comprobante digital.</w:t>
+              <w:t>Detalle que debe mostrar la imagen: Bandeja de citas del paciente con fecha, médico, estado verificado y comprobante digital.</w:t>
+            </w:r>
+          </w:p>
+          <w:p>
+            <w:pPr>
+              <w:spacing w:before="240" w:after="240"/>
+              <w:jc w:val="center"/>
+            </w:pPr>
+            <w:r>
+              <w:rPr>
+                <w:i/>
+                <w:color w:val="788CA0"/>
+                <w:sz w:val="18"/>
+              </w:rPr>
+              <w:t>╔════════════════════════════════════════════════════════════════════╗</w:t>
+              <w:br/>
+              <w:t xml:space="preserve">  [ ESPACIO PARA CAPTURA #8: PANEL DEL PACIENTE CON CITA CONFIRMADA Y BOLETA DIGITAL ]  </w:t>
+              <w:br/>
+              <w:t xml:space="preserve">  (Haz clic aquí y presiona Ctrl + V para insertar tu captura)  </w:t>
+              <w:br/>
+              <w:t>╚════════════════════════════════════════════════════════════════════╝</w:t>
             </w:r>
           </w:p>
         </w:tc>

</xml_diff>

<commit_message>
Docs: Añadir Evidencia #8 de bloqueo de seguridad HTTP 403 Forbidden y actualizar Word
</commit_message>
<xml_diff>
--- a/docs/INFORME_FINAL_PRUEBAS_SOFTWARE_UTP.docx
+++ b/docs/INFORME_FINAL_PRUEBAS_SOFTWARE_UTP.docx
@@ -4408,7 +4408,7 @@
                 <w:color w:val="002D62"/>
                 <w:sz w:val="21"/>
               </w:rPr>
-              <w:t>📷 [EVIDENCIA #8: PANEL DEL PACIENTE CON CITA CONFIRMADA Y BOLETA DIGITAL]</w:t>
+              <w:t>📷 [EVIDENCIA #8: EVIDENCIA DE BLOQUEO DE SEGURIDAD (HTTP 403 FORBIDDEN / HTTP 302 REDIRECTION)]</w:t>
               <w:br/>
             </w:r>
             <w:r>
@@ -4417,7 +4417,7 @@
                 <w:color w:val="B45309"/>
                 <w:sz w:val="19"/>
               </w:rPr>
-              <w:t>👉 Indicación para el equipo de pruebas (Grupo 7): Pegar aquí la captura del dashboard del paciente (http://localhost:8081/dashboard-router) mostrando la cita en estado 'Confirmada' y su boleta digital emitida (CP-015).</w:t>
+              <w:t>👉 Indicación para el equipo de pruebas (Grupo 7): Abrir las herramientas de desarrollador del navegador (F12 -&gt; pestaña Network/Red) o utilizar Postman / MockMvc test para evidenciar el bloqueo de seguridad. Capturar el momento en que se intenta ingresar a /admin con una cuenta de paciente y el servidor responde con HTTP 403 Forbidden, o el acceso sin credenciales a /dashboard retornando HTTP 302 hacia /login.</w:t>
               <w:br/>
             </w:r>
             <w:r>
@@ -4425,27 +4425,47 @@
                 <w:color w:val="64748B"/>
                 <w:sz w:val="19"/>
               </w:rPr>
-              <w:t>Detalle que debe mostrar la imagen: Bandeja de citas del paciente con fecha, médico, estado verificado y comprobante digital.</w:t>
+              <w:t>Detalle que debe mostrar la imagen: Captura de pantalla mostrando la consola de red o la página de error HTTP 403 Forbidden al denegar el acceso a un paciente en rutas administrativas, o la redirección 302 a login.</w:t>
             </w:r>
           </w:p>
           <w:p>
             <w:pPr>
-              <w:spacing w:before="240" w:after="240"/>
+              <w:spacing w:before="160" w:after="80"/>
               <w:jc w:val="center"/>
             </w:pPr>
             <w:r>
-              <w:rPr>
-                <w:i/>
-                <w:color w:val="788CA0"/>
-                <w:sz w:val="18"/>
-              </w:rPr>
-              <w:t>╔════════════════════════════════════════════════════════════════════╗</w:t>
-              <w:br/>
-              <w:t xml:space="preserve">  [ ESPACIO PARA CAPTURA #8: PANEL DEL PACIENTE CON CITA CONFIRMADA Y BOLETA DIGITAL ]  </w:t>
-              <w:br/>
-              <w:t xml:space="preserve">  (Haz clic aquí y presiona Ctrl + V para insertar tu captura)  </w:t>
-              <w:br/>
-              <w:t>╚════════════════════════════════════════════════════════════════════╝</w:t>
+              <w:drawing>
+                <wp:inline xmlns:a="http://schemas.openxmlformats.org/drawingml/2006/main" xmlns:pic="http://schemas.openxmlformats.org/drawingml/2006/picture">
+                  <wp:extent cx="5669280" cy="3401568"/>
+                  <wp:docPr id="2" name="Picture 2"/>
+                  <wp:cNvGraphicFramePr>
+                    <a:graphicFrameLocks noChangeAspect="1"/>
+                  </wp:cNvGraphicFramePr>
+                  <a:graphic>
+                    <a:graphicData uri="http://schemas.openxmlformats.org/drawingml/2006/picture">
+                      <pic:pic>
+                        <pic:nvPicPr>
+                          <pic:cNvPr id="0" name="evidencia_8_bloqueo_seguridad_403.png"/>
+                          <pic:cNvPicPr/>
+                        </pic:nvPicPr>
+                        <pic:blipFill>
+                          <a:blip r:embed="rId10"/>
+                          <a:stretch>
+                            <a:fillRect/>
+                          </a:stretch>
+                        </pic:blipFill>
+                        <pic:spPr>
+                          <a:xfrm>
+                            <a:off x="0" y="0"/>
+                            <a:ext cx="5669280" cy="3401568"/>
+                          </a:xfrm>
+                          <a:prstGeom prst="rect"/>
+                        </pic:spPr>
+                      </pic:pic>
+                    </a:graphicData>
+                  </a:graphic>
+                </wp:inline>
+              </w:drawing>
             </w:r>
           </w:p>
         </w:tc>

</xml_diff>